<commit_message>
Add print preview docx ranap neonatus medis
</commit_message>
<xml_diff>
--- a/public/doc/emr/print_rajal_neonatus_dokter.docx
+++ b/public/doc/emr/print_rajal_neonatus_dokter.docx
@@ -138,7 +138,23 @@
                 <w:b/>
                 <w:szCs w:val="16"/>
               </w:rPr>
-              <w:t>Jl. Mayor Sunaryo No.37, Jetis, Sukoharjo 57512 Telp (0271) 593979</w:t>
+              <w:t xml:space="preserve">Jl. Mayor Sunaryo No.37, Jetis, </w:t>
+            </w:r>
+            <w:proofErr w:type="spellStart"/>
+            <w:r>
+              <w:rPr>
+                <w:b/>
+                <w:szCs w:val="16"/>
+              </w:rPr>
+              <w:t>Sukoharjo</w:t>
+            </w:r>
+            <w:proofErr w:type="spellEnd"/>
+            <w:r>
+              <w:rPr>
+                <w:b/>
+                <w:szCs w:val="16"/>
+              </w:rPr>
+              <w:t xml:space="preserve"> 57512 Telp (0271) 593979</w:t>
             </w:r>
             <w:r>
               <w:rPr>
@@ -468,7 +484,37 @@
                 <w:sz w:val="26"/>
                 <w:szCs w:val="26"/>
               </w:rPr>
-              <w:t>RM 3 e 1</w:t>
+              <w:t xml:space="preserve">RM </w:t>
+            </w:r>
+            <w:r>
+              <w:rPr>
+                <w:b/>
+                <w:bCs/>
+                <w:noProof/>
+                <w:sz w:val="26"/>
+                <w:szCs w:val="26"/>
+              </w:rPr>
+              <w:t>0</w:t>
+            </w:r>
+            <w:r>
+              <w:rPr>
+                <w:b/>
+                <w:bCs/>
+                <w:noProof/>
+                <w:sz w:val="26"/>
+                <w:szCs w:val="26"/>
+              </w:rPr>
+              <w:t xml:space="preserve">3 e </w:t>
+            </w:r>
+            <w:r>
+              <w:rPr>
+                <w:b/>
+                <w:bCs/>
+                <w:noProof/>
+                <w:sz w:val="26"/>
+                <w:szCs w:val="26"/>
+              </w:rPr>
+              <w:t>3</w:t>
             </w:r>
           </w:p>
         </w:tc>
@@ -564,9 +610,11 @@
                 <w:lang w:val="en-ID"/>
               </w:rPr>
             </w:pPr>
+            <w:proofErr w:type="spellStart"/>
             <w:r>
               <w:t>Tanggal</w:t>
             </w:r>
+            <w:proofErr w:type="spellEnd"/>
             <w:r>
               <w:t xml:space="preserve"> </w:t>
             </w:r>
@@ -653,76 +701,6 @@
       </w:tr>
     </w:tbl>
     <w:p/>
-    <w:tbl>
-      <w:tblPr>
-        <w:tblStyle w:val="TableGrid"/>
-        <w:tblW w:w="0" w:type="auto"/>
-        <w:tblLayout w:type="fixed"/>
-        <w:tblLook w:val="04A0" w:firstRow="1" w:lastRow="0" w:firstColumn="1" w:lastColumn="0" w:noHBand="0" w:noVBand="1"/>
-      </w:tblPr>
-      <w:tblGrid>
-        <w:gridCol w:w="2802"/>
-        <w:gridCol w:w="8505"/>
-      </w:tblGrid>
-      <w:tr>
-        <w:trPr>
-          <w:trHeight w:val="282"/>
-        </w:trPr>
-        <w:tc>
-          <w:tcPr>
-            <w:tcW w:w="2802" w:type="dxa"/>
-          </w:tcPr>
-          <w:p>
-            <w:pPr>
-              <w:rPr>
-                <w:b/>
-                <w:bCs/>
-                <w:sz w:val="20"/>
-                <w:szCs w:val="20"/>
-              </w:rPr>
-            </w:pPr>
-            <w:r>
-              <w:rPr>
-                <w:b/>
-                <w:bCs/>
-                <w:sz w:val="20"/>
-                <w:szCs w:val="20"/>
-              </w:rPr>
-              <w:t>ANAMNE</w:t>
-            </w:r>
-            <w:r>
-              <w:rPr>
-                <w:b/>
-                <w:bCs/>
-                <w:sz w:val="20"/>
-                <w:szCs w:val="20"/>
-              </w:rPr>
-              <w:t>SIS</w:t>
-            </w:r>
-          </w:p>
-        </w:tc>
-        <w:tc>
-          <w:tcPr>
-            <w:tcW w:w="8505" w:type="dxa"/>
-            <w:vAlign w:val="center"/>
-          </w:tcPr>
-          <w:p>
-            <w:pPr>
-              <w:rPr>
-                <w:sz w:val="16"/>
-                <w:szCs w:val="20"/>
-              </w:rPr>
-            </w:pPr>
-            <w:r>
-              <w:rPr>
-                <w:sz w:val="17"/>
-              </w:rPr>
-              <w:t>${ANAMNESIS_DIPEROLEH}</w:t>
-            </w:r>
-          </w:p>
-        </w:tc>
-      </w:tr>
-    </w:tbl>
     <w:tbl>
       <w:tblPr>
         <w:tblStyle w:val="TableGrid"/>
@@ -738,211 +716,27 @@
       <w:tr>
         <w:tc>
           <w:tcPr>
-            <w:tcW w:w="370" w:type="dxa"/>
+            <w:tcW w:w="3063" w:type="dxa"/>
+            <w:gridSpan w:val="3"/>
           </w:tcPr>
           <w:p>
             <w:r>
-              <w:t>1.</w:t>
-            </w:r>
-          </w:p>
-        </w:tc>
-        <w:tc>
-          <w:tcPr>
-            <w:tcW w:w="2426" w:type="dxa"/>
-          </w:tcPr>
-          <w:p>
-            <w:r>
-              <w:t>Keluhan Utama</w:t>
-            </w:r>
-          </w:p>
-        </w:tc>
-        <w:tc>
-          <w:tcPr>
-            <w:tcW w:w="267" w:type="dxa"/>
-          </w:tcPr>
-          <w:p>
-            <w:r>
-              <w:t>:</w:t>
-            </w:r>
-          </w:p>
-        </w:tc>
-        <w:tc>
-          <w:tcPr>
-            <w:tcW w:w="8244" w:type="dxa"/>
-          </w:tcPr>
-          <w:p>
-            <w:r>
               <w:rPr>
-                <w:sz w:val="17"/>
+                <w:b/>
+                <w:bCs/>
+                <w:sz w:val="20"/>
+                <w:szCs w:val="20"/>
               </w:rPr>
-              <w:t>${KELUHAN_UTAMA}</w:t>
-            </w:r>
-          </w:p>
-        </w:tc>
-      </w:tr>
-      <w:tr>
-        <w:tc>
-          <w:tcPr>
-            <w:tcW w:w="370" w:type="dxa"/>
-          </w:tcPr>
-          <w:p>
-            <w:r>
-              <w:t>2.</w:t>
-            </w:r>
-          </w:p>
-        </w:tc>
-        <w:tc>
-          <w:tcPr>
-            <w:tcW w:w="2426" w:type="dxa"/>
-          </w:tcPr>
-          <w:p>
-            <w:r>
-              <w:t>Riwayat Penyakit Sekarang</w:t>
-            </w:r>
-          </w:p>
-        </w:tc>
-        <w:tc>
-          <w:tcPr>
-            <w:tcW w:w="267" w:type="dxa"/>
-          </w:tcPr>
-          <w:p>
-            <w:r>
-              <w:t>:</w:t>
-            </w:r>
-          </w:p>
-        </w:tc>
-        <w:tc>
-          <w:tcPr>
-            <w:tcW w:w="8244" w:type="dxa"/>
-          </w:tcPr>
-          <w:p>
+              <w:t>ANAMNE</w:t>
+            </w:r>
             <w:r>
               <w:rPr>
-                <w:sz w:val="17"/>
+                <w:b/>
+                <w:bCs/>
+                <w:sz w:val="20"/>
+                <w:szCs w:val="20"/>
               </w:rPr>
-              <w:t>${RIWAYAT_PENYAKIT_SEKARANG}</w:t>
-            </w:r>
-          </w:p>
-        </w:tc>
-      </w:tr>
-      <w:tr>
-        <w:tc>
-          <w:tcPr>
-            <w:tcW w:w="370" w:type="dxa"/>
-          </w:tcPr>
-          <w:p>
-            <w:r>
-              <w:t>3.</w:t>
-            </w:r>
-          </w:p>
-        </w:tc>
-        <w:tc>
-          <w:tcPr>
-            <w:tcW w:w="2426" w:type="dxa"/>
-          </w:tcPr>
-          <w:p>
-            <w:r>
-              <w:t>Riwayat Penyakit Dahulu</w:t>
-            </w:r>
-          </w:p>
-        </w:tc>
-        <w:tc>
-          <w:tcPr>
-            <w:tcW w:w="267" w:type="dxa"/>
-          </w:tcPr>
-          <w:p>
-            <w:r>
-              <w:t>:</w:t>
-            </w:r>
-          </w:p>
-        </w:tc>
-        <w:tc>
-          <w:tcPr>
-            <w:tcW w:w="8244" w:type="dxa"/>
-          </w:tcPr>
-          <w:p>
-            <w:r>
-              <w:rPr>
-                <w:sz w:val="17"/>
-              </w:rPr>
-              <w:t>${RIWAYAT_PENYAKIT_DAHULU}</w:t>
-            </w:r>
-          </w:p>
-        </w:tc>
-      </w:tr>
-      <w:tr>
-        <w:tc>
-          <w:tcPr>
-            <w:tcW w:w="370" w:type="dxa"/>
-          </w:tcPr>
-          <w:p>
-            <w:r>
-              <w:t>4.</w:t>
-            </w:r>
-          </w:p>
-        </w:tc>
-        <w:tc>
-          <w:tcPr>
-            <w:tcW w:w="2426" w:type="dxa"/>
-          </w:tcPr>
-          <w:p>
-            <w:r>
-              <w:t>Riwayat Penyakit Keluarga</w:t>
-            </w:r>
-          </w:p>
-        </w:tc>
-        <w:tc>
-          <w:tcPr>
-            <w:tcW w:w="267" w:type="dxa"/>
-          </w:tcPr>
-          <w:p>
-            <w:r>
-              <w:t>:</w:t>
-            </w:r>
-          </w:p>
-        </w:tc>
-        <w:tc>
-          <w:tcPr>
-            <w:tcW w:w="8244" w:type="dxa"/>
-          </w:tcPr>
-          <w:p>
-            <w:r>
-              <w:rPr>
-                <w:sz w:val="17"/>
-              </w:rPr>
-              <w:t>${RIWAYAT_PENYAKIT_KELUARGA}</w:t>
-            </w:r>
-          </w:p>
-        </w:tc>
-      </w:tr>
-      <w:tr>
-        <w:tc>
-          <w:tcPr>
-            <w:tcW w:w="370" w:type="dxa"/>
-          </w:tcPr>
-          <w:p>
-            <w:r>
-              <w:t>5.</w:t>
-            </w:r>
-          </w:p>
-        </w:tc>
-        <w:tc>
-          <w:tcPr>
-            <w:tcW w:w="2426" w:type="dxa"/>
-          </w:tcPr>
-          <w:p>
-            <w:r>
-              <w:t>Riwayat Tumbuh Kembang</w:t>
-            </w:r>
-          </w:p>
-        </w:tc>
-        <w:tc>
-          <w:tcPr>
-            <w:tcW w:w="267" w:type="dxa"/>
-          </w:tcPr>
-          <w:p>
-            <w:r>
-              <w:t>:</w:t>
+              <w:t>SIS</w:t>
             </w:r>
           </w:p>
         </w:tc>
@@ -960,7 +754,7 @@
               <w:rPr>
                 <w:sz w:val="17"/>
               </w:rPr>
-              <w:t>${RIWAYAT_TUMBUH_KEMBANG}</w:t>
+              <w:t>${ANAMNESIS_DIPEROLEH}</w:t>
             </w:r>
           </w:p>
         </w:tc>
@@ -972,7 +766,7 @@
           </w:tcPr>
           <w:p>
             <w:r>
-              <w:t>6.</w:t>
+              <w:t>1.</w:t>
             </w:r>
           </w:p>
         </w:tc>
@@ -981,8 +775,240 @@
             <w:tcW w:w="2426" w:type="dxa"/>
           </w:tcPr>
           <w:p>
-            <w:r>
-              <w:t>Riwayat Kelahiran</w:t>
+            <w:proofErr w:type="spellStart"/>
+            <w:r>
+              <w:t>Keluhan</w:t>
+            </w:r>
+            <w:proofErr w:type="spellEnd"/>
+            <w:r>
+              <w:t xml:space="preserve"> Utama</w:t>
+            </w:r>
+          </w:p>
+        </w:tc>
+        <w:tc>
+          <w:tcPr>
+            <w:tcW w:w="267" w:type="dxa"/>
+          </w:tcPr>
+          <w:p>
+            <w:r>
+              <w:t>:</w:t>
+            </w:r>
+          </w:p>
+        </w:tc>
+        <w:tc>
+          <w:tcPr>
+            <w:tcW w:w="8244" w:type="dxa"/>
+          </w:tcPr>
+          <w:p>
+            <w:r>
+              <w:rPr>
+                <w:sz w:val="17"/>
+              </w:rPr>
+              <w:t>${KELUHAN_UTAMA}</w:t>
+            </w:r>
+          </w:p>
+        </w:tc>
+      </w:tr>
+      <w:tr>
+        <w:tc>
+          <w:tcPr>
+            <w:tcW w:w="370" w:type="dxa"/>
+          </w:tcPr>
+          <w:p>
+            <w:r>
+              <w:t>2.</w:t>
+            </w:r>
+          </w:p>
+        </w:tc>
+        <w:tc>
+          <w:tcPr>
+            <w:tcW w:w="2426" w:type="dxa"/>
+          </w:tcPr>
+          <w:p>
+            <w:r>
+              <w:t xml:space="preserve">Riwayat </w:t>
+            </w:r>
+            <w:proofErr w:type="spellStart"/>
+            <w:r>
+              <w:t>Penyakit</w:t>
+            </w:r>
+            <w:proofErr w:type="spellEnd"/>
+            <w:r>
+              <w:t xml:space="preserve"> </w:t>
+            </w:r>
+            <w:proofErr w:type="spellStart"/>
+            <w:r>
+              <w:t>Sekarang</w:t>
+            </w:r>
+            <w:proofErr w:type="spellEnd"/>
+          </w:p>
+        </w:tc>
+        <w:tc>
+          <w:tcPr>
+            <w:tcW w:w="267" w:type="dxa"/>
+          </w:tcPr>
+          <w:p>
+            <w:r>
+              <w:t>:</w:t>
+            </w:r>
+          </w:p>
+        </w:tc>
+        <w:tc>
+          <w:tcPr>
+            <w:tcW w:w="8244" w:type="dxa"/>
+          </w:tcPr>
+          <w:p>
+            <w:r>
+              <w:rPr>
+                <w:sz w:val="17"/>
+              </w:rPr>
+              <w:t>${RIWAYAT_PENYAKIT_SEKARANG}</w:t>
+            </w:r>
+          </w:p>
+        </w:tc>
+      </w:tr>
+      <w:tr>
+        <w:tc>
+          <w:tcPr>
+            <w:tcW w:w="370" w:type="dxa"/>
+          </w:tcPr>
+          <w:p>
+            <w:r>
+              <w:t>3.</w:t>
+            </w:r>
+          </w:p>
+        </w:tc>
+        <w:tc>
+          <w:tcPr>
+            <w:tcW w:w="2426" w:type="dxa"/>
+          </w:tcPr>
+          <w:p>
+            <w:r>
+              <w:t xml:space="preserve">Riwayat </w:t>
+            </w:r>
+            <w:proofErr w:type="spellStart"/>
+            <w:r>
+              <w:t>Penyakit</w:t>
+            </w:r>
+            <w:proofErr w:type="spellEnd"/>
+            <w:r>
+              <w:t xml:space="preserve"> </w:t>
+            </w:r>
+            <w:proofErr w:type="spellStart"/>
+            <w:r>
+              <w:t>Dahulu</w:t>
+            </w:r>
+            <w:proofErr w:type="spellEnd"/>
+          </w:p>
+        </w:tc>
+        <w:tc>
+          <w:tcPr>
+            <w:tcW w:w="267" w:type="dxa"/>
+          </w:tcPr>
+          <w:p>
+            <w:r>
+              <w:t>:</w:t>
+            </w:r>
+          </w:p>
+        </w:tc>
+        <w:tc>
+          <w:tcPr>
+            <w:tcW w:w="8244" w:type="dxa"/>
+          </w:tcPr>
+          <w:p>
+            <w:r>
+              <w:rPr>
+                <w:sz w:val="17"/>
+              </w:rPr>
+              <w:t>${RIWAYAT_PENYAKIT_DAHULU}</w:t>
+            </w:r>
+          </w:p>
+        </w:tc>
+      </w:tr>
+      <w:tr>
+        <w:tc>
+          <w:tcPr>
+            <w:tcW w:w="370" w:type="dxa"/>
+          </w:tcPr>
+          <w:p>
+            <w:r>
+              <w:t>4.</w:t>
+            </w:r>
+          </w:p>
+        </w:tc>
+        <w:tc>
+          <w:tcPr>
+            <w:tcW w:w="2426" w:type="dxa"/>
+          </w:tcPr>
+          <w:p>
+            <w:r>
+              <w:t xml:space="preserve">Riwayat </w:t>
+            </w:r>
+            <w:proofErr w:type="spellStart"/>
+            <w:r>
+              <w:t>Penyakit</w:t>
+            </w:r>
+            <w:proofErr w:type="spellEnd"/>
+            <w:r>
+              <w:t xml:space="preserve"> </w:t>
+            </w:r>
+            <w:proofErr w:type="spellStart"/>
+            <w:r>
+              <w:t>Keluarga</w:t>
+            </w:r>
+            <w:proofErr w:type="spellEnd"/>
+          </w:p>
+        </w:tc>
+        <w:tc>
+          <w:tcPr>
+            <w:tcW w:w="267" w:type="dxa"/>
+          </w:tcPr>
+          <w:p>
+            <w:r>
+              <w:t>:</w:t>
+            </w:r>
+          </w:p>
+        </w:tc>
+        <w:tc>
+          <w:tcPr>
+            <w:tcW w:w="8244" w:type="dxa"/>
+          </w:tcPr>
+          <w:p>
+            <w:r>
+              <w:rPr>
+                <w:sz w:val="17"/>
+              </w:rPr>
+              <w:t>${RIWAYAT_PENYAKIT_KELUARGA}</w:t>
+            </w:r>
+          </w:p>
+        </w:tc>
+      </w:tr>
+      <w:tr>
+        <w:tc>
+          <w:tcPr>
+            <w:tcW w:w="370" w:type="dxa"/>
+          </w:tcPr>
+          <w:p>
+            <w:r>
+              <w:t>5.</w:t>
+            </w:r>
+          </w:p>
+        </w:tc>
+        <w:tc>
+          <w:tcPr>
+            <w:tcW w:w="2426" w:type="dxa"/>
+          </w:tcPr>
+          <w:p>
+            <w:r>
+              <w:t xml:space="preserve">Riwayat </w:t>
+            </w:r>
+            <w:proofErr w:type="spellStart"/>
+            <w:r>
+              <w:t>Tumbuh</w:t>
+            </w:r>
+            <w:proofErr w:type="spellEnd"/>
+            <w:r>
+              <w:t xml:space="preserve"> Kembang</w:t>
             </w:r>
           </w:p>
         </w:tc>
@@ -1010,7 +1036,7 @@
               <w:rPr>
                 <w:sz w:val="17"/>
               </w:rPr>
-              <w:t>${RIWAYAT_KELAHIRAN}</w:t>
+              <w:t>${RIWAYAT_TUMBUH_KEMBANG}</w:t>
             </w:r>
           </w:p>
         </w:tc>
@@ -1022,7 +1048,7 @@
           </w:tcPr>
           <w:p>
             <w:r>
-              <w:t>7.</w:t>
+              <w:t>6.</w:t>
             </w:r>
           </w:p>
         </w:tc>
@@ -1032,8 +1058,13 @@
           </w:tcPr>
           <w:p>
             <w:r>
-              <w:t>Usia Kehamilan</w:t>
-            </w:r>
+              <w:t xml:space="preserve">Riwayat </w:t>
+            </w:r>
+            <w:proofErr w:type="spellStart"/>
+            <w:r>
+              <w:t>Kelahiran</w:t>
+            </w:r>
+            <w:proofErr w:type="spellEnd"/>
           </w:p>
         </w:tc>
         <w:tc>
@@ -1060,7 +1091,7 @@
               <w:rPr>
                 <w:sz w:val="17"/>
               </w:rPr>
-              <w:t>${USIA_KEHAMILAN}</w:t>
+              <w:t>${RIWAYAT_KELAHIRAN}</w:t>
             </w:r>
           </w:p>
         </w:tc>
@@ -1072,7 +1103,7 @@
           </w:tcPr>
           <w:p>
             <w:r>
-              <w:t>8.</w:t>
+              <w:t>7.</w:t>
             </w:r>
           </w:p>
         </w:tc>
@@ -1081,9 +1112,71 @@
             <w:tcW w:w="2426" w:type="dxa"/>
           </w:tcPr>
           <w:p>
+            <w:proofErr w:type="spellStart"/>
+            <w:r>
+              <w:t>Usia</w:t>
+            </w:r>
+            <w:proofErr w:type="spellEnd"/>
+            <w:r>
+              <w:t xml:space="preserve"> </w:t>
+            </w:r>
+            <w:proofErr w:type="spellStart"/>
+            <w:r>
+              <w:t>Kehamilan</w:t>
+            </w:r>
+            <w:proofErr w:type="spellEnd"/>
+          </w:p>
+        </w:tc>
+        <w:tc>
+          <w:tcPr>
+            <w:tcW w:w="267" w:type="dxa"/>
+          </w:tcPr>
+          <w:p>
+            <w:r>
+              <w:t>:</w:t>
+            </w:r>
+          </w:p>
+        </w:tc>
+        <w:tc>
+          <w:tcPr>
+            <w:tcW w:w="8244" w:type="dxa"/>
+          </w:tcPr>
+          <w:p>
+            <w:pPr>
+              <w:rPr>
+                <w:sz w:val="17"/>
+              </w:rPr>
+            </w:pPr>
+            <w:r>
+              <w:rPr>
+                <w:sz w:val="17"/>
+              </w:rPr>
+              <w:t>${USIA_KEHAMILAN}</w:t>
+            </w:r>
+          </w:p>
+        </w:tc>
+      </w:tr>
+      <w:tr>
+        <w:tc>
+          <w:tcPr>
+            <w:tcW w:w="370" w:type="dxa"/>
+          </w:tcPr>
+          <w:p>
+            <w:r>
+              <w:t>8.</w:t>
+            </w:r>
+          </w:p>
+        </w:tc>
+        <w:tc>
+          <w:tcPr>
+            <w:tcW w:w="2426" w:type="dxa"/>
+          </w:tcPr>
+          <w:p>
+            <w:proofErr w:type="spellStart"/>
             <w:r>
               <w:t>Persalinan</w:t>
             </w:r>
+            <w:proofErr w:type="spellEnd"/>
           </w:p>
         </w:tc>
         <w:tc>
@@ -1176,8 +1269,8 @@
       <w:tblGrid>
         <w:gridCol w:w="2802"/>
         <w:gridCol w:w="283"/>
-        <w:gridCol w:w="3260"/>
-        <w:gridCol w:w="1134"/>
+        <w:gridCol w:w="2977"/>
+        <w:gridCol w:w="1417"/>
         <w:gridCol w:w="284"/>
         <w:gridCol w:w="3544"/>
       </w:tblGrid>
@@ -1206,8 +1299,13 @@
             <w:tcW w:w="2802" w:type="dxa"/>
           </w:tcPr>
           <w:p>
-            <w:r>
-              <w:t>Keadaan Umum</w:t>
+            <w:proofErr w:type="spellStart"/>
+            <w:r>
+              <w:t>Keadaan</w:t>
+            </w:r>
+            <w:proofErr w:type="spellEnd"/>
+            <w:r>
+              <w:t xml:space="preserve"> Umum</w:t>
             </w:r>
           </w:p>
         </w:tc>
@@ -1242,9 +1340,11 @@
             <w:tcW w:w="2802" w:type="dxa"/>
           </w:tcPr>
           <w:p>
-            <w:r>
-              <w:t>Tekanan Darah</w:t>
-            </w:r>
+            <w:proofErr w:type="spellStart"/>
+            <w:r>
+              <w:t>Kesadaran</w:t>
+            </w:r>
+            <w:proofErr w:type="spellEnd"/>
           </w:p>
         </w:tc>
         <w:tc>
@@ -1259,7 +1359,8 @@
         </w:tc>
         <w:tc>
           <w:tcPr>
-            <w:tcW w:w="3260" w:type="dxa"/>
+            <w:tcW w:w="8222" w:type="dxa"/>
+            <w:gridSpan w:val="4"/>
           </w:tcPr>
           <w:p>
             <w:pPr>
@@ -1271,50 +1372,7 @@
               <w:rPr>
                 <w:sz w:val="17"/>
               </w:rPr>
-              <w:t>${TEKANAN_DARAH}</w:t>
-            </w:r>
-          </w:p>
-        </w:tc>
-        <w:tc>
-          <w:tcPr>
-            <w:tcW w:w="1134" w:type="dxa"/>
-          </w:tcPr>
-          <w:p>
-            <w:pPr>
-              <w:ind w:right="-105"/>
-            </w:pPr>
-            <w:r>
-              <w:t>Saturasi O</w:t>
-            </w:r>
-            <w:r>
-              <w:rPr>
-                <w:bCs/>
-                <w:sz w:val="17"/>
-              </w:rPr>
-              <w:t>₂</w:t>
-            </w:r>
-          </w:p>
-        </w:tc>
-        <w:tc>
-          <w:tcPr>
-            <w:tcW w:w="284" w:type="dxa"/>
-          </w:tcPr>
-          <w:p>
-            <w:r>
-              <w:t>:</w:t>
-            </w:r>
-          </w:p>
-        </w:tc>
-        <w:tc>
-          <w:tcPr>
-            <w:tcW w:w="3544" w:type="dxa"/>
-          </w:tcPr>
-          <w:p>
-            <w:r>
-              <w:rPr>
-                <w:sz w:val="17"/>
-              </w:rPr>
-              <w:t>${SATURASI_O2}</w:t>
+              <w:t>${KESADARAN_GCS}</w:t>
             </w:r>
           </w:p>
         </w:tc>
@@ -1325,8 +1383,13 @@
             <w:tcW w:w="2802" w:type="dxa"/>
           </w:tcPr>
           <w:p>
-            <w:r>
-              <w:t>Frekuensi Nadi</w:t>
+            <w:proofErr w:type="spellStart"/>
+            <w:r>
+              <w:t>Frekuensi</w:t>
+            </w:r>
+            <w:proofErr w:type="spellEnd"/>
+            <w:r>
+              <w:t xml:space="preserve"> Nadi</w:t>
             </w:r>
           </w:p>
         </w:tc>
@@ -1342,7 +1405,7 @@
         </w:tc>
         <w:tc>
           <w:tcPr>
-            <w:tcW w:w="3260" w:type="dxa"/>
+            <w:tcW w:w="2977" w:type="dxa"/>
           </w:tcPr>
           <w:p>
             <w:pPr>
@@ -1360,14 +1423,26 @@
         </w:tc>
         <w:tc>
           <w:tcPr>
-            <w:tcW w:w="1134" w:type="dxa"/>
+            <w:tcW w:w="1417" w:type="dxa"/>
           </w:tcPr>
           <w:p>
             <w:pPr>
               <w:ind w:right="-105"/>
             </w:pPr>
-            <w:r>
-              <w:t>GCS</w:t>
+            <w:proofErr w:type="spellStart"/>
+            <w:r>
+              <w:t>Saturasi</w:t>
+            </w:r>
+            <w:proofErr w:type="spellEnd"/>
+            <w:r>
+              <w:t xml:space="preserve"> O</w:t>
+            </w:r>
+            <w:r>
+              <w:rPr>
+                <w:bCs/>
+                <w:sz w:val="17"/>
+              </w:rPr>
+              <w:t>₂</w:t>
             </w:r>
           </w:p>
         </w:tc>
@@ -1390,7 +1465,7 @@
               <w:rPr>
                 <w:sz w:val="17"/>
               </w:rPr>
-              <w:t>${KESADARAN_GCS}</w:t>
+              <w:t>${SATURASI_O2}</w:t>
             </w:r>
           </w:p>
         </w:tc>
@@ -1401,8 +1476,13 @@
             <w:tcW w:w="2802" w:type="dxa"/>
           </w:tcPr>
           <w:p>
-            <w:r>
-              <w:t>Frekuensi Nafas</w:t>
+            <w:proofErr w:type="spellStart"/>
+            <w:r>
+              <w:t>Frekuensi</w:t>
+            </w:r>
+            <w:proofErr w:type="spellEnd"/>
+            <w:r>
+              <w:t xml:space="preserve"> Nafas</w:t>
             </w:r>
           </w:p>
         </w:tc>
@@ -1418,7 +1498,7 @@
         </w:tc>
         <w:tc>
           <w:tcPr>
-            <w:tcW w:w="3260" w:type="dxa"/>
+            <w:tcW w:w="2977" w:type="dxa"/>
           </w:tcPr>
           <w:p>
             <w:pPr>
@@ -1436,14 +1516,14 @@
         </w:tc>
         <w:tc>
           <w:tcPr>
-            <w:tcW w:w="1134" w:type="dxa"/>
+            <w:tcW w:w="1417" w:type="dxa"/>
           </w:tcPr>
           <w:p>
             <w:pPr>
               <w:ind w:right="-105"/>
             </w:pPr>
             <w:r>
-              <w:t>BB / TB</w:t>
+              <w:t>Berat Badan</w:t>
             </w:r>
           </w:p>
         </w:tc>
@@ -1466,7 +1546,7 @@
               <w:rPr>
                 <w:sz w:val="17"/>
               </w:rPr>
-              <w:t>${BERAT_BADAN} / ${TINGGI_BADAN}</w:t>
+              <w:t>${BERAT_BADAN}</w:t>
             </w:r>
           </w:p>
         </w:tc>
@@ -1477,9 +1557,11 @@
             <w:tcW w:w="2802" w:type="dxa"/>
           </w:tcPr>
           <w:p>
+            <w:proofErr w:type="spellStart"/>
             <w:r>
               <w:t>Suhu</w:t>
             </w:r>
+            <w:proofErr w:type="spellEnd"/>
           </w:p>
         </w:tc>
         <w:tc>
@@ -1494,7 +1576,7 @@
         </w:tc>
         <w:tc>
           <w:tcPr>
-            <w:tcW w:w="3260" w:type="dxa"/>
+            <w:tcW w:w="2977" w:type="dxa"/>
           </w:tcPr>
           <w:p>
             <w:pPr>
@@ -1512,14 +1594,14 @@
         </w:tc>
         <w:tc>
           <w:tcPr>
-            <w:tcW w:w="1134" w:type="dxa"/>
+            <w:tcW w:w="1417" w:type="dxa"/>
           </w:tcPr>
           <w:p>
             <w:pPr>
               <w:ind w:right="-105"/>
             </w:pPr>
             <w:r>
-              <w:t>IMT</w:t>
+              <w:t>Panjang Badan</w:t>
             </w:r>
           </w:p>
         </w:tc>
@@ -1542,7 +1624,7 @@
               <w:rPr>
                 <w:sz w:val="17"/>
               </w:rPr>
-              <w:t>${IMT}</w:t>
+              <w:t>${TINGGI_BADAN}</w:t>
             </w:r>
           </w:p>
         </w:tc>
@@ -1645,8 +1727,13 @@
           </w:tcPr>
           <w:p>
             <w:r>
-              <w:t>Hasil Laboratorium</w:t>
-            </w:r>
+              <w:t xml:space="preserve">Hasil </w:t>
+            </w:r>
+            <w:proofErr w:type="spellStart"/>
+            <w:r>
+              <w:t>Laboratorium</w:t>
+            </w:r>
+            <w:proofErr w:type="spellEnd"/>
           </w:p>
         </w:tc>
         <w:tc>
@@ -1685,8 +1772,13 @@
           </w:tcPr>
           <w:p>
             <w:r>
-              <w:t>Hasil Radiologi</w:t>
-            </w:r>
+              <w:t xml:space="preserve">Hasil </w:t>
+            </w:r>
+            <w:proofErr w:type="spellStart"/>
+            <w:r>
+              <w:t>Radiologi</w:t>
+            </w:r>
+            <w:proofErr w:type="spellEnd"/>
           </w:p>
         </w:tc>
         <w:tc>
@@ -2159,8 +2251,33 @@
                 <w:b/>
                 <w:bCs/>
               </w:rPr>
-              <w:t>Yang Melakukan Pengkajian</w:t>
-            </w:r>
+              <w:t xml:space="preserve">Yang </w:t>
+            </w:r>
+            <w:proofErr w:type="spellStart"/>
+            <w:r>
+              <w:rPr>
+                <w:b/>
+                <w:bCs/>
+              </w:rPr>
+              <w:t>Melakukan</w:t>
+            </w:r>
+            <w:proofErr w:type="spellEnd"/>
+            <w:r>
+              <w:rPr>
+                <w:b/>
+                <w:bCs/>
+              </w:rPr>
+              <w:t xml:space="preserve"> </w:t>
+            </w:r>
+            <w:proofErr w:type="spellStart"/>
+            <w:r>
+              <w:rPr>
+                <w:b/>
+                <w:bCs/>
+              </w:rPr>
+              <w:t>Pengkajian</w:t>
+            </w:r>
+            <w:proofErr w:type="spellEnd"/>
           </w:p>
           <w:p>
             <w:pPr>
@@ -2246,8 +2363,18 @@
                 <w:szCs w:val="18"/>
                 <w:lang w:val="en-ID"/>
               </w:rPr>
-              <w:t>Tanda Tangan dan Nama Lengkap</w:t>
-            </w:r>
+              <w:t xml:space="preserve">Tanda Tangan dan Nama </w:t>
+            </w:r>
+            <w:proofErr w:type="spellStart"/>
+            <w:r>
+              <w:rPr>
+                <w:sz w:val="14"/>
+                <w:szCs w:val="18"/>
+                <w:lang w:val="en-ID"/>
+              </w:rPr>
+              <w:t>Lengkap</w:t>
+            </w:r>
+            <w:proofErr w:type="spellEnd"/>
           </w:p>
         </w:tc>
       </w:tr>
@@ -2305,34 +2432,6 @@
         <w:lang w:val="en-ID"/>
       </w:rPr>
     </w:pPr>
-    <w:r>
-      <w:rPr>
-        <w:i/>
-        <w:iCs/>
-        <w:sz w:val="16"/>
-        <w:szCs w:val="20"/>
-      </w:rPr>
-      <w:t>Formulir ini dicetak pada ${</w:t>
-    </w:r>
-    <w:r>
-      <w:rPr>
-        <w:i/>
-        <w:iCs/>
-        <w:sz w:val="16"/>
-        <w:szCs w:val="20"/>
-        <w:lang w:val="en-ID"/>
-      </w:rPr>
-      <w:t>TANGGAL_CETAK</w:t>
-    </w:r>
-    <w:r>
-      <w:rPr>
-        <w:i/>
-        <w:iCs/>
-        <w:sz w:val="16"/>
-        <w:szCs w:val="20"/>
-      </w:rPr>
-      <w:t>}</w:t>
-    </w:r>
   </w:p>
 </w:ftr>
 </file>

</xml_diff>